<commit_message>
Switch play flow to beatmap list
Updated the Play action to load the BeatmapList scene instead of MusicPlay, aligning the main gameplay entry point with the beatmap selection flow. This also includes a refresh of the Webgrafia document and removal of a temporary Word lock file.
</commit_message>
<xml_diff>
--- a/Word e assim/Webgrafia.docx
+++ b/Word e assim/Webgrafia.docx
@@ -123,7 +123,59 @@
         </w:r>
       </w:hyperlink>
     </w:p>
-    <w:p/>
+    <w:p>
+      <w:pPr>
+        <w:rPr>
+          <w:rStyle w:val="Hyperlink"/>
+        </w:rPr>
+      </w:pPr>
+      <w:r>
+        <w:fldChar w:fldCharType="begin"/>
+      </w:r>
+      <w:r>
+        <w:instrText>HYPERLINK "https://docs.unity3d.com/ScriptReference/Events.UnityEvent.AddListener.html"</w:instrText>
+      </w:r>
+      <w:r>
+        <w:fldChar w:fldCharType="separate"/>
+      </w:r>
+      <w:r>
+        <w:rPr>
+          <w:rStyle w:val="Hyperlink"/>
+        </w:rPr>
+        <w:t xml:space="preserve">Manual </w:t>
+      </w:r>
+      <w:proofErr w:type="spellStart"/>
+      <w:r>
+        <w:rPr>
+          <w:rStyle w:val="Hyperlink"/>
+        </w:rPr>
+        <w:t>UnityEvent</w:t>
+      </w:r>
+      <w:proofErr w:type="spellEnd"/>
+      <w:r>
+        <w:rPr>
+          <w:rStyle w:val="Hyperlink"/>
+        </w:rPr>
+        <w:t xml:space="preserve"> Add L</w:t>
+      </w:r>
+      <w:r>
+        <w:rPr>
+          <w:rStyle w:val="Hyperlink"/>
+        </w:rPr>
+        <w:t>i</w:t>
+      </w:r>
+      <w:r>
+        <w:rPr>
+          <w:rStyle w:val="Hyperlink"/>
+        </w:rPr>
+        <w:t>stener</w:t>
+      </w:r>
+    </w:p>
+    <w:p>
+      <w:r>
+        <w:fldChar w:fldCharType="end"/>
+      </w:r>
+    </w:p>
     <w:sectPr>
       <w:pgSz w:w="12240" w:h="15840"/>
       <w:pgMar w:top="1440" w:right="1440" w:bottom="1440" w:left="1440" w:header="720" w:footer="720" w:gutter="0"/>

</xml_diff>